<commit_message>
Fix validation-sample description: census is any-mention positives, not any-use; rebuild PDF, DOCX, and cover letter
</commit_message>
<xml_diff>
--- a/frontiers/manuscript.docx
+++ b/frontiers/manuscript.docx
@@ -3050,7 +3050,7 @@
         <w:pStyle w:val="BodyText"/>
       </w:pPr>
       <w:r>
-        <w:t xml:space="preserve">The validation sample was intentionally oversampled for primary-model positives to ensure sufficient observations to estimate classification performance. We included all 123 brochures that the primary model classified as positive for the composite any-use measure, and a fixed-seed random sample of 57 brochures chosen from the 265 primary-model negatives. So, naïve validation statistics would not reproduce the distribution of the full analytic sample, because primary positives and negatives had different probabilities of entering the verification sample.</w:t>
+        <w:t xml:space="preserve">The validation sample was intentionally oversampled for primary-model positives to ensure sufficient observations to estimate classification performance. We included all 123 brochures that the primary model classified as positive on the any-mention measure (any of the five labels a–e), and a fixed-seed random sample of 57 brochures chosen from the 265 corresponding primary-model negatives. So, naïve validation statistics would not reproduce the distribution of the full analytic sample, because primary positives and negatives had different probabilities of entering the verification sample.</w:t>
       </w:r>
     </w:p>
     <w:p>
@@ -3078,7 +3078,7 @@
         <w:t xml:space="preserve"> </w:t>
       </w:r>
       <w:r>
-        <w:t xml:space="preserve">were calculated to represent the full classified sample. Verification weighting does not impact the precision of the any-use measure, because all primary-model positive cases were included in the validation set. We also report per-label agreement statistics and F1 scores.</w:t>
+        <w:t xml:space="preserve">were calculated to represent the full classified sample. Verification weighting does not impact the precision of the any-use measure, because every brochure the primary model labeled as any-use positive falls within the censused any-mention–positive stratum and therefore entered the validation set with certainty. We also report per-label agreement statistics and F1 scores.</w:t>
       </w:r>
     </w:p>
     <w:p>
@@ -6355,7 +6355,27 @@
         <w:pStyle w:val="TableCaption"/>
       </w:pPr>
       <w:r>
-        <w:t xml:space="preserve">Independent cross-family validation on the blinded 180-brochure verification sample. Metrics are design-weighted (Horvitz–Thompson) to the full classified population: model-positive brochures are censused (inclusion probability 1) and 57 of 265 model-negatives are sampled (inclusion probability 0.215), so each brochure is weighted by the inverse of its inclusion probability. Reference is an independent blind re-coding by a different model family; the primary classifier is gpt-4o. Precision is invariant to the weighting (it conditions on the censused model-positive stratum); recall,</w:t>
+        <w:t xml:space="preserve">Independent cross-family validation on the blinded 180-brochure verification sample. Metrics are design-weighted (Horvitz–Thompson) to the full classified population: model-positive brochures (positive on any of labels a–e, i.e. any mention;</w:t>
+      </w:r>
+      <w:r>
+        <w:t xml:space="preserve"> </w:t>
+      </w:r>
+      <m:oMath>
+        <m:r>
+          <m:t>n</m:t>
+        </m:r>
+        <m:r>
+          <m:rPr>
+            <m:sty m:val="p"/>
+          </m:rPr>
+          <m:t>=</m:t>
+        </m:r>
+        <m:r>
+          <m:t>123</m:t>
+        </m:r>
+      </m:oMath>
+      <w:r>
+        <w:t xml:space="preserve">) are censused (inclusion probability 1) and 57 of 265 model-negatives are sampled (inclusion probability 0.215), so each brochure is weighted by the inverse of its inclusion probability. Reference is an independent blind re-coding by a different model family; the primary classifier is gpt-4o. Precision is invariant to the weighting (it conditions on the censused model-positive stratum); recall,</w:t>
       </w:r>
       <w:r>
         <w:t xml:space="preserve"> </w:t>
@@ -6384,7 +6404,7 @@
         <w:tblW w:type="auto" w:w="0"/>
         <w:tblLook w:firstRow="1" w:lastRow="0" w:firstColumn="0" w:lastColumn="0" w:noHBand="0" w:noVBand="0" w:val="0020"/>
         <w:jc w:val="start"/>
-        <w:tblCaption w:val="Independent cross-family validation on the blinded 180-brochure verification sample. Metrics are design-weighted (Horvitz–Thompson) to the full classified population: model-positive brochures are censused (inclusion probability 1) and 57 of 265 model-negatives are sampled (inclusion probability 0.215), so each brochure is weighted by the inverse of its inclusion probability. Reference is an independent blind re-coding by a different model family; the primary classifier is gpt-4o. Precision is invariant to the weighting (it conditions on the censused model-positive stratum); recall, \kappa, agreement, and prevalence-and-bias-adjusted agreement (PABAK; (Byrt, Bishop, and Carlin 1993)) are design-weighted. Same-family reproducibility (gpt-4o vs. gpt-4o-mini, 60 brochures) is reported in the text."/>
+        <w:tblCaption w:val="Independent cross-family validation on the blinded 180-brochure verification sample. Metrics are design-weighted (Horvitz–Thompson) to the full classified population: model-positive brochures (positive on any of labels a–e, i.e. any mention; n = 123) are censused (inclusion probability 1) and 57 of 265 model-negatives are sampled (inclusion probability 0.215), so each brochure is weighted by the inverse of its inclusion probability. Reference is an independent blind re-coding by a different model family; the primary classifier is gpt-4o. Precision is invariant to the weighting (it conditions on the censused model-positive stratum); recall, \kappa, agreement, and prevalence-and-bias-adjusted agreement (PABAK; (Byrt, Bishop, and Carlin 1993)) are design-weighted. Same-family reproducibility (gpt-4o vs. gpt-4o-mini, 60 brochures) is reported in the text."/>
       </w:tblPr>
       <w:tblGrid>
         <w:gridCol w:w="1131"/>

</xml_diff>